<commit_message>
Fix Joey 24 - now Joey writing to Frank with fatherhood advice
</commit_message>
<xml_diff>
--- a/stories/docx/Joey 24.docx
+++ b/stories/docx/Joey 24.docx
@@ -7,7 +7,7 @@
         <w:pStyle w:val="FirstParagraph"/>
       </w:pPr>
       <w:r>
-        <w:t xml:space="preserve">Joey,</w:t>
+        <w:t xml:space="preserve">Dearest Frank,</w:t>
       </w:r>
     </w:p>
     <w:p>
@@ -15,7 +15,7 @@
         <w:pStyle w:val="BodyText"/>
       </w:pPr>
       <w:r>
-        <w:t xml:space="preserve">I am sitting in the garden outside our house. The sun is warm, the air smells like the hills, and our son is playing in the grass. His name is Antonio, after Lucia’s father. He is three years old now, and he has her eyes.</w:t>
+        <w:t xml:space="preserve">I am sitting at the kitchen table. The morning light is coming through the window, and the smell of Ma’s cooking fills the air. It is a Tuesday, the same as every Tuesday, but everything is different now.</w:t>
       </w:r>
     </w:p>
     <w:p>
@@ -23,7 +23,7 @@
         <w:pStyle w:val="BodyText"/>
       </w:pPr>
       <w:r>
-        <w:t xml:space="preserve">Lucia is inside, cooking. The smell drifts out the window, and it makes me think of you, of the kitchen in Brooklyn, of mornings when everything was simple. I wish you could smell this. I wish you could see this.</w:t>
+        <w:t xml:space="preserve">You are in Italy. You and Lucia and little Antonio. I received your letter last week — the one where you described the garden, the goats, the view from the hillside. I read it aloud to Ma, and she cried. She always does when she gets news of you.</w:t>
       </w:r>
     </w:p>
     <w:p>
@@ -31,7 +31,7 @@
         <w:pStyle w:val="BodyText"/>
       </w:pPr>
       <w:r>
-        <w:t xml:space="preserve">We built this house together. Lucia and I. It took two years, but we did it. A small place on the hillside, with a garden and a view that stretches out forever. We have chickens, and a goat, and more cats than we can count. Antonio loves the cats.</w:t>
+        <w:t xml:space="preserve">The store is busy. We hired a new clerk last month, a kid from the neighborhood who needed the work. He is good. Honest. I am teaching him everything I know.</w:t>
       </w:r>
     </w:p>
     <w:p>
@@ -39,7 +39,7 @@
         <w:pStyle w:val="BodyText"/>
       </w:pPr>
       <w:r>
-        <w:t xml:space="preserve">The town is coming back. Slowly, but surely. The people who lived in the tunnels, the ones we helped escape, they are all here now. We rebuild together. It is hard work, but it is good work. The kind of work that makes you tired at the end of the day and grateful for every morning that follows.</w:t>
+        <w:t xml:space="preserve">I want to tell you something, Frank. Something I have been thinking about for a long time.</w:t>
       </w:r>
     </w:p>
     <w:p>
@@ -47,7 +47,7 @@
         <w:pStyle w:val="BodyText"/>
       </w:pPr>
       <w:r>
-        <w:t xml:space="preserve">Lucia’s mother visits us every week. She brings bread and stories, and she plays with Antonio while we work. We call her Nonna, and Antonio adores her.</w:t>
+        <w:t xml:space="preserve">When you first told me about Lucia, I did not know what to expect. A girl from the hills of Italy, part of something secret, living in tunnels — it sounded like a story. But it was real. And now you have a son. A little boy with her eyes.</w:t>
       </w:r>
     </w:p>
     <w:p>
@@ -55,7 +55,7 @@
         <w:pStyle w:val="BodyText"/>
       </w:pPr>
       <w:r>
-        <w:t xml:space="preserve">You write every month, a letter arrives, full of news from the store, from the apartment, from Brooklyn. You are doing well. The store is thriving, better than ever. You say you are proud of me, and I do not know how to respond to that. I am proud of you.</w:t>
+        <w:t xml:space="preserve">If you become a father someday — and from the way you talk about Antonio, I know you will — here is what I want you to know:</w:t>
       </w:r>
     </w:p>
     <w:p>
@@ -63,7 +63,7 @@
         <w:pStyle w:val="BodyText"/>
       </w:pPr>
       <w:r>
-        <w:t xml:space="preserve">Joey — if you become a father someday, here is what I want you to know. Be patient. Children do not come with instructions. They will frustrate you, scare you, make you want to scream. But they will also make you more alive than you have ever been. Every morning, look at their face and remember: this is why I am here.</w:t>
+        <w:t xml:space="preserve">Be patient. Children do not come with instructions. They will frustrate you, scare you, make you want to scream. But they will also make you more alive than you have ever been. Every morning, look at their face and remember: this is why I am here. This is what I fight for.</w:t>
       </w:r>
     </w:p>
     <w:p>
@@ -71,7 +71,7 @@
         <w:pStyle w:val="BodyText"/>
       </w:pPr>
       <w:r>
-        <w:t xml:space="preserve">Teach them about the people who came before. About Pop, about Ma, about the store. They need to know where they come from. That is what makes them strong.</w:t>
+        <w:t xml:space="preserve">Teach them about the people who came before. About Pop, about Ma, about the store, about everything we built. They need to know where they come from. That is what makes them strong.</w:t>
       </w:r>
     </w:p>
     <w:p>
@@ -79,7 +79,7 @@
         <w:pStyle w:val="BodyText"/>
       </w:pPr>
       <w:r>
-        <w:t xml:space="preserve">Come visit someday. Bring Ma. Show Antonio the ocean. Let him run through the streets the way we did. Let him sit in the kitchen and smell Ma’s cooking.</w:t>
+        <w:t xml:space="preserve">And when they grow up and want to leave — let them. You cannot hold them back. You can only love them, support them, and hope they find what they are looking for. That is what Ma did with us. That is what we have to do.</w:t>
       </w:r>
     </w:p>
     <w:p>
@@ -87,7 +87,7 @@
         <w:pStyle w:val="BodyText"/>
       </w:pPr>
       <w:r>
-        <w:t xml:space="preserve">I wish you could see this. I wish you could meet Antonio. I wish you could sit in this garden and know that everything worked out.</w:t>
+        <w:t xml:space="preserve">Come visit someday, Frank. Bring Lucia. Bring Antonio. Show him the store. Show him Brooklyn. Let him run through the aisles the way we did when we were kids. Let Ma hold him. She deserves that.</w:t>
       </w:r>
     </w:p>
     <w:p>
@@ -95,7 +95,7 @@
         <w:pStyle w:val="BodyText"/>
       </w:pPr>
       <w:r>
-        <w:t xml:space="preserve">I love you, brother. I will see you again someday.</w:t>
+        <w:t xml:space="preserve">I miss you. Every day. But I am proud of you. That will never change.</w:t>
       </w:r>
     </w:p>
     <w:p>
@@ -103,13 +103,13 @@
         <w:pStyle w:val="BodyText"/>
       </w:pPr>
       <w:r>
-        <w:t xml:space="preserve">Your loving son,</w:t>
+        <w:t xml:space="preserve">Your loving brother,</w:t>
       </w:r>
       <w:r>
         <w:t xml:space="preserve"> </w:t>
       </w:r>
       <w:r>
-        <w:t xml:space="preserve">Frank</w:t>
+        <w:t xml:space="preserve">Joey</w:t>
       </w:r>
     </w:p>
     <w:sectPr/>

</xml_diff>

<commit_message>
Joey 24 - Frank mentions receiving letters from Ma and Joey
</commit_message>
<xml_diff>
--- a/stories/docx/Joey 24.docx
+++ b/stories/docx/Joey 24.docx
@@ -7,109 +7,133 @@
         <w:pStyle w:val="FirstParagraph"/>
       </w:pPr>
       <w:r>
-        <w:t xml:space="preserve">Dearest Frank,</w:t>
-      </w:r>
-    </w:p>
-    <w:p>
-      <w:pPr>
-        <w:pStyle w:val="BodyText"/>
-      </w:pPr>
-      <w:r>
-        <w:t xml:space="preserve">I am sitting at the kitchen table. The morning light is coming through the window, and the smell of Ma’s cooking fills the air. It is a Tuesday, the same as every Tuesday, but everything is different now.</w:t>
-      </w:r>
-    </w:p>
-    <w:p>
-      <w:pPr>
-        <w:pStyle w:val="BodyText"/>
-      </w:pPr>
-      <w:r>
-        <w:t xml:space="preserve">You are in Italy. You and Lucia and little Antonio. I received your letter last week — the one where you described the garden, the goats, the view from the hillside. I read it aloud to Ma, and she cried. She always does when she gets news of you.</w:t>
-      </w:r>
-    </w:p>
-    <w:p>
-      <w:pPr>
-        <w:pStyle w:val="BodyText"/>
-      </w:pPr>
-      <w:r>
-        <w:t xml:space="preserve">The store is busy. We hired a new clerk last month, a kid from the neighborhood who needed the work. He is good. Honest. I am teaching him everything I know.</w:t>
-      </w:r>
-    </w:p>
-    <w:p>
-      <w:pPr>
-        <w:pStyle w:val="BodyText"/>
-      </w:pPr>
-      <w:r>
-        <w:t xml:space="preserve">I want to tell you something, Frank. Something I have been thinking about for a long time.</w:t>
-      </w:r>
-    </w:p>
-    <w:p>
-      <w:pPr>
-        <w:pStyle w:val="BodyText"/>
-      </w:pPr>
-      <w:r>
-        <w:t xml:space="preserve">When you first told me about Lucia, I did not know what to expect. A girl from the hills of Italy, part of something secret, living in tunnels — it sounded like a story. But it was real. And now you have a son. A little boy with her eyes.</w:t>
-      </w:r>
-    </w:p>
-    <w:p>
-      <w:pPr>
-        <w:pStyle w:val="BodyText"/>
-      </w:pPr>
-      <w:r>
-        <w:t xml:space="preserve">If you become a father someday — and from the way you talk about Antonio, I know you will — here is what I want you to know:</w:t>
-      </w:r>
-    </w:p>
-    <w:p>
-      <w:pPr>
-        <w:pStyle w:val="BodyText"/>
-      </w:pPr>
-      <w:r>
-        <w:t xml:space="preserve">Be patient. Children do not come with instructions. They will frustrate you, scare you, make you want to scream. But they will also make you more alive than you have ever been. Every morning, look at their face and remember: this is why I am here. This is what I fight for.</w:t>
-      </w:r>
-    </w:p>
-    <w:p>
-      <w:pPr>
-        <w:pStyle w:val="BodyText"/>
-      </w:pPr>
-      <w:r>
-        <w:t xml:space="preserve">Teach them about the people who came before. About Pop, about Ma, about the store, about everything we built. They need to know where they come from. That is what makes them strong.</w:t>
-      </w:r>
-    </w:p>
-    <w:p>
-      <w:pPr>
-        <w:pStyle w:val="BodyText"/>
-      </w:pPr>
-      <w:r>
-        <w:t xml:space="preserve">And when they grow up and want to leave — let them. You cannot hold them back. You can only love them, support them, and hope they find what they are looking for. That is what Ma did with us. That is what we have to do.</w:t>
-      </w:r>
-    </w:p>
-    <w:p>
-      <w:pPr>
-        <w:pStyle w:val="BodyText"/>
-      </w:pPr>
-      <w:r>
-        <w:t xml:space="preserve">Come visit someday, Frank. Bring Lucia. Bring Antonio. Show him the store. Show him Brooklyn. Let him run through the aisles the way we did when we were kids. Let Ma hold him. She deserves that.</w:t>
-      </w:r>
-    </w:p>
-    <w:p>
-      <w:pPr>
-        <w:pStyle w:val="BodyText"/>
-      </w:pPr>
-      <w:r>
-        <w:t xml:space="preserve">I miss you. Every day. But I am proud of you. That will never change.</w:t>
-      </w:r>
-    </w:p>
-    <w:p>
-      <w:pPr>
-        <w:pStyle w:val="BodyText"/>
-      </w:pPr>
-      <w:r>
-        <w:t xml:space="preserve">Your loving brother,</w:t>
+        <w:t xml:space="preserve">Dearest Joey,</w:t>
+      </w:r>
+    </w:p>
+    <w:p>
+      <w:pPr>
+        <w:pStyle w:val="BodyText"/>
+      </w:pPr>
+      <w:r>
+        <w:t xml:space="preserve">I am sitting in the garden outside our house. The sun is warm, the air smells like the hills, and our son is playing in the grass. His name is Antonio. He is three years old now.</w:t>
+      </w:r>
+    </w:p>
+    <w:p>
+      <w:pPr>
+        <w:pStyle w:val="BodyText"/>
+      </w:pPr>
+      <w:r>
+        <w:t xml:space="preserve">Lucia is inside, cooking. The smell drifts out the window, and it makes me think of you, of the kitchen in Brooklyn. I wish you could smell this.</w:t>
+      </w:r>
+    </w:p>
+    <w:p>
+      <w:pPr>
+        <w:pStyle w:val="BodyText"/>
+      </w:pPr>
+      <w:r>
+        <w:t xml:space="preserve">We built this house together. It took two years. A small place on the hillside, with a garden and a view that stretches out forever. We have chickens, a goat, more cats than we can count. Antonio loves the cats. He chases them around the garden and laughs when they run.</w:t>
+      </w:r>
+    </w:p>
+    <w:p>
+      <w:pPr>
+        <w:pStyle w:val="BodyText"/>
+      </w:pPr>
+      <w:r>
+        <w:t xml:space="preserve">The town is coming back. The people who lived in the tunnels, the ones we helped escape, they are all here now. We rebuild together.</w:t>
+      </w:r>
+    </w:p>
+    <w:p>
+      <w:pPr>
+        <w:pStyle w:val="BodyText"/>
+      </w:pPr>
+      <w:r>
+        <w:t xml:space="preserve">Lucia’s mother visits us every week. We call her Nonna, and Antonio adores her.</w:t>
+      </w:r>
+    </w:p>
+    <w:p>
+      <w:pPr>
+        <w:pStyle w:val="BodyText"/>
+      </w:pPr>
+      <w:r>
+        <w:t xml:space="preserve">Your letters arrive every month, full of news from the store. Ma writes too — her letters are shorter now, her hands not as steady, but every word is precious.</w:t>
+      </w:r>
+    </w:p>
+    <w:p>
+      <w:pPr>
+        <w:pStyle w:val="BodyText"/>
+      </w:pPr>
+      <w:r>
+        <w:t xml:space="preserve">You are doing well. The store is thriving. You say you are proud of me, and I do not know how to respond. I am proud of you.</w:t>
+      </w:r>
+    </w:p>
+    <w:p>
+      <w:pPr>
+        <w:pStyle w:val="BodyText"/>
+      </w:pPr>
+      <w:r>
+        <w:t xml:space="preserve">Joey — if you become a father someday, here is what I want you to know:</w:t>
+      </w:r>
+    </w:p>
+    <w:p>
+      <w:pPr>
+        <w:pStyle w:val="BodyText"/>
+      </w:pPr>
+      <w:r>
+        <w:t xml:space="preserve">Be patient. Children do not come with instructions. They will frustrate you, scare you. But they will also make you more alive than you have ever been.</w:t>
+      </w:r>
+    </w:p>
+    <w:p>
+      <w:pPr>
+        <w:pStyle w:val="BodyText"/>
+      </w:pPr>
+      <w:r>
+        <w:t xml:space="preserve">Teach them about the people who came before. About Pop, about Ma, about the store. They need to know where they come from.</w:t>
+      </w:r>
+    </w:p>
+    <w:p>
+      <w:pPr>
+        <w:pStyle w:val="BodyText"/>
+      </w:pPr>
+      <w:r>
+        <w:t xml:space="preserve">And when they grow up and want to leave — let them. You cannot hold them back. You can only love them and support them.</w:t>
+      </w:r>
+    </w:p>
+    <w:p>
+      <w:pPr>
+        <w:pStyle w:val="BodyText"/>
+      </w:pPr>
+      <w:r>
+        <w:t xml:space="preserve">Come visit someday. Bring Ma. Show Antonio the ocean. Let him run through the streets the way we did.</w:t>
+      </w:r>
+    </w:p>
+    <w:p>
+      <w:pPr>
+        <w:pStyle w:val="BodyText"/>
+      </w:pPr>
+      <w:r>
+        <w:t xml:space="preserve">I wish you could see this. I wish you could meet him. Everything worked out. The war, the tunnels, the mission — all of it was worth it.</w:t>
+      </w:r>
+    </w:p>
+    <w:p>
+      <w:pPr>
+        <w:pStyle w:val="BodyText"/>
+      </w:pPr>
+      <w:r>
+        <w:t xml:space="preserve">I love you, brother. I will see you again someday.</w:t>
+      </w:r>
+    </w:p>
+    <w:p>
+      <w:pPr>
+        <w:pStyle w:val="BodyText"/>
+      </w:pPr>
+      <w:r>
+        <w:t xml:space="preserve">Your loving son,</w:t>
       </w:r>
       <w:r>
         <w:t xml:space="preserve"> </w:t>
       </w:r>
       <w:r>
-        <w:t xml:space="preserve">Joey</w:t>
+        <w:t xml:space="preserve">Frank</w:t>
       </w:r>
     </w:p>
     <w:sectPr/>

</xml_diff>